<commit_message>
feat: agregar nuevas plantillas
</commit_message>
<xml_diff>
--- a/pesaje/analytica/Report/PrintActaConformidad.docx
+++ b/pesaje/analytica/Report/PrintActaConformidad.docx
@@ -1,6 +1,6 @@
 
 <file path=word/document.xml><?xml version="1.0" encoding="utf-8"?>
-<w:document xmlns:wpc="http://schemas.microsoft.com/office/word/2010/wordprocessingCanvas" xmlns:cx="http://schemas.microsoft.com/office/drawing/2014/chartex" xmlns:cx1="http://schemas.microsoft.com/office/drawing/2015/9/8/chartex" xmlns:cx2="http://schemas.microsoft.com/office/drawing/2015/10/21/chartex" xmlns:cx3="http://schemas.microsoft.com/office/drawing/2016/5/9/chartex" xmlns:cx4="http://schemas.microsoft.com/office/drawing/2016/5/10/chartex" xmlns:cx5="http://schemas.microsoft.com/office/drawing/2016/5/11/chartex" xmlns:cx6="http://schemas.microsoft.com/office/drawing/2016/5/12/chartex" xmlns:cx7="http://schemas.microsoft.com/office/drawing/2016/5/13/chartex" xmlns:cx8="http://schemas.microsoft.com/office/drawing/2016/5/14/chartex" xmlns:mc="http://schemas.openxmlformats.org/markup-compatibility/2006" xmlns:aink="http://schemas.microsoft.com/office/drawing/2016/ink" xmlns:am3d="http://schemas.microsoft.com/office/drawing/2017/model3d" xmlns:o="urn:schemas-microsoft-com:office:office" xmlns:oel="http://schemas.microsoft.com/office/2019/extlst" xmlns:r="http://schemas.openxmlformats.org/officeDocument/2006/relationships" xmlns:m="http://schemas.openxmlformats.org/officeDocument/2006/math" xmlns:v="urn:schemas-microsoft-com:vml" xmlns:wp14="http://schemas.microsoft.com/office/word/2010/wordprocessingDrawing" xmlns:wp="http://schemas.openxmlformats.org/drawingml/2006/wordprocessingDrawing" xmlns:w10="urn:schemas-microsoft-com:office:word" xmlns:w="http://schemas.openxmlformats.org/wordprocessingml/2006/main" xmlns:w14="http://schemas.microsoft.com/office/word/2010/wordml" xmlns:w15="http://schemas.microsoft.com/office/word/2012/wordml" xmlns:w16cei="http://schemas.microsoft.com/office/word/2026/wordml/cei" xmlns:w16cex="http://schemas.microsoft.com/office/word/2018/wordml/cex" xmlns:w16cid="http://schemas.microsoft.com/office/word/2016/wordml/cid" xmlns:w16="http://schemas.microsoft.com/office/word/2018/wordml" xmlns:w16du="http://schemas.microsoft.com/office/word/2023/wordml/word16du" xmlns:w16sdtdh="http://schemas.microsoft.com/office/word/2020/wordml/sdtdatahash" xmlns:w16sdtfl="http://schemas.microsoft.com/office/word/2024/wordml/sdtformatlock" xmlns:w16se="http://schemas.microsoft.com/office/word/2015/wordml/symex" xmlns:wpg="http://schemas.microsoft.com/office/word/2010/wordprocessingGroup" xmlns:wpi="http://schemas.microsoft.com/office/word/2010/wordprocessingInk" xmlns:wne="http://schemas.microsoft.com/office/word/2006/wordml" xmlns:wps="http://schemas.microsoft.com/office/word/2010/wordprocessingShape" mc:Ignorable="w14 w15 w16se w16cid w16 w16cex w16sdtdh w16sdtfl w16du wp14">
+<w:document xmlns:wpc="http://schemas.microsoft.com/office/word/2010/wordprocessingCanvas" xmlns:cx="http://schemas.microsoft.com/office/drawing/2014/chartex" xmlns:cx1="http://schemas.microsoft.com/office/drawing/2015/9/8/chartex" xmlns:cx2="http://schemas.microsoft.com/office/drawing/2015/10/21/chartex" xmlns:cx3="http://schemas.microsoft.com/office/drawing/2016/5/9/chartex" xmlns:cx4="http://schemas.microsoft.com/office/drawing/2016/5/10/chartex" xmlns:cx5="http://schemas.microsoft.com/office/drawing/2016/5/11/chartex" xmlns:cx6="http://schemas.microsoft.com/office/drawing/2016/5/12/chartex" xmlns:cx7="http://schemas.microsoft.com/office/drawing/2016/5/13/chartex" xmlns:cx8="http://schemas.microsoft.com/office/drawing/2016/5/14/chartex" xmlns:mc="http://schemas.openxmlformats.org/markup-compatibility/2006" xmlns:aink="http://schemas.microsoft.com/office/drawing/2016/ink" xmlns:am3d="http://schemas.microsoft.com/office/drawing/2017/model3d" xmlns:o="urn:schemas-microsoft-com:office:office" xmlns:oel="http://schemas.microsoft.com/office/2019/extlst" xmlns:r="http://schemas.openxmlformats.org/officeDocument/2006/relationships" xmlns:m="http://schemas.openxmlformats.org/officeDocument/2006/math" xmlns:v="urn:schemas-microsoft-com:vml" xmlns:wp14="http://schemas.microsoft.com/office/word/2010/wordprocessingDrawing" xmlns:wp="http://schemas.openxmlformats.org/drawingml/2006/wordprocessingDrawing" xmlns:w10="urn:schemas-microsoft-com:office:word" xmlns:w="http://schemas.openxmlformats.org/wordprocessingml/2006/main" xmlns:w14="http://schemas.microsoft.com/office/word/2010/wordml" xmlns:w15="http://schemas.microsoft.com/office/word/2012/wordml" xmlns:w16cex="http://schemas.microsoft.com/office/word/2018/wordml/cex" xmlns:w16cid="http://schemas.microsoft.com/office/word/2016/wordml/cid" xmlns:w16="http://schemas.microsoft.com/office/word/2018/wordml" xmlns:w16du="http://schemas.microsoft.com/office/word/2023/wordml/word16du" xmlns:w16sdtdh="http://schemas.microsoft.com/office/word/2020/wordml/sdtdatahash" xmlns:w16sdtfl="http://schemas.microsoft.com/office/word/2024/wordml/sdtformatlock" xmlns:w16se="http://schemas.microsoft.com/office/word/2015/wordml/symex" xmlns:wpg="http://schemas.microsoft.com/office/word/2010/wordprocessingGroup" xmlns:wpi="http://schemas.microsoft.com/office/word/2010/wordprocessingInk" xmlns:wne="http://schemas.microsoft.com/office/word/2006/wordml" xmlns:wps="http://schemas.microsoft.com/office/word/2010/wordprocessingShape" mc:Ignorable="w14 w15 w16se w16cid w16 w16cex w16sdtdh w16sdtfl w16du wp14">
   <w:body>
     <w:tbl>
       <w:tblPr>
@@ -437,7 +437,7 @@
               </wp:anchor>
             </w:drawing>
           </mc:Choice>
-          <mc:Fallback>
+          <mc:Fallback xmlns:w16cei="http://schemas.microsoft.com/office/word/2026/wordml/cei">
             <w:pict>
               <v:roundrect w14:anchorId="36262E0B" id="Rectángulo: esquinas redondeadas 782399144" o:spid="_x0000_s1026" style="position:absolute;margin-left:-10.6pt;margin-top:-69.3pt;width:157.1pt;height:54.7pt;z-index:251659264;visibility:visible;mso-wrap-style:square;mso-width-percent:0;mso-height-percent:0;mso-wrap-distance-left:9pt;mso-wrap-distance-top:0;mso-wrap-distance-right:9pt;mso-wrap-distance-bottom:0;mso-position-horizontal:absolute;mso-position-horizontal-relative:margin;mso-position-vertical:absolute;mso-position-vertical-relative:text;mso-width-percent:0;mso-height-percent:0;mso-width-relative:margin;mso-height-relative:margin;v-text-anchor:top" arcsize="10923f" o:gfxdata="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" filled="f" stroked="f">
                 <v:stroke joinstyle="miter"/>
@@ -1578,25 +1578,7 @@
                 <w:sz w:val="16"/>
                 <w:szCs w:val="16"/>
               </w:rPr>
-              <w:t>«</w:t>
-            </w:r>
-            <w:proofErr w:type="spellStart"/>
-            <w:r>
-              <w:rPr>
-                <w:rFonts w:ascii="Calibri" w:hAnsi="Calibri" w:cs="Calibri"/>
-                <w:sz w:val="16"/>
-                <w:szCs w:val="16"/>
-              </w:rPr>
-              <w:t>item</w:t>
-            </w:r>
-            <w:proofErr w:type="spellEnd"/>
-            <w:r>
-              <w:rPr>
-                <w:rFonts w:ascii="Calibri" w:hAnsi="Calibri" w:cs="Calibri"/>
-                <w:sz w:val="16"/>
-                <w:szCs w:val="16"/>
-              </w:rPr>
-              <w:t>»</w:t>
+              <w:t>«item»</w:t>
             </w:r>
             <w:r>
               <w:rPr>
@@ -1655,25 +1637,7 @@
                 <w:sz w:val="16"/>
                 <w:szCs w:val="16"/>
               </w:rPr>
-              <w:t>«</w:t>
-            </w:r>
-            <w:proofErr w:type="spellStart"/>
-            <w:r>
-              <w:rPr>
-                <w:rFonts w:ascii="Calibri" w:hAnsi="Calibri" w:cs="Calibri"/>
-                <w:sz w:val="16"/>
-                <w:szCs w:val="16"/>
-              </w:rPr>
-              <w:t>nro_lote</w:t>
-            </w:r>
-            <w:proofErr w:type="spellEnd"/>
-            <w:r>
-              <w:rPr>
-                <w:rFonts w:ascii="Calibri" w:hAnsi="Calibri" w:cs="Calibri"/>
-                <w:sz w:val="16"/>
-                <w:szCs w:val="16"/>
-              </w:rPr>
-              <w:t>»</w:t>
+              <w:t>«nro_lote»</w:t>
             </w:r>
             <w:r>
               <w:rPr>
@@ -1716,6 +1680,66 @@
                 <w:sz w:val="16"/>
                 <w:szCs w:val="16"/>
               </w:rPr>
+              <w:instrText xml:space="preserve"> MERGEFIELD  cant  \* MERGEFORMAT </w:instrText>
+            </w:r>
+            <w:r>
+              <w:rPr>
+                <w:rFonts w:ascii="Calibri" w:hAnsi="Calibri" w:cs="Calibri"/>
+                <w:sz w:val="16"/>
+                <w:szCs w:val="16"/>
+              </w:rPr>
+              <w:fldChar w:fldCharType="separate"/>
+            </w:r>
+            <w:r>
+              <w:rPr>
+                <w:rFonts w:ascii="Calibri" w:hAnsi="Calibri" w:cs="Calibri"/>
+                <w:noProof/>
+                <w:sz w:val="16"/>
+                <w:szCs w:val="16"/>
+              </w:rPr>
+              <w:t>«cant»</w:t>
+            </w:r>
+            <w:r>
+              <w:rPr>
+                <w:rFonts w:ascii="Calibri" w:hAnsi="Calibri" w:cs="Calibri"/>
+                <w:sz w:val="16"/>
+                <w:szCs w:val="16"/>
+              </w:rPr>
+              <w:fldChar w:fldCharType="end"/>
+            </w:r>
+          </w:p>
+        </w:tc>
+        <w:tc>
+          <w:tcPr>
+            <w:tcW w:w="1276" w:type="dxa"/>
+          </w:tcPr>
+          <w:p>
+            <w:pPr>
+              <w:tabs>
+                <w:tab w:val="left" w:pos="284"/>
+              </w:tabs>
+              <w:ind w:right="-1"/>
+              <w:jc w:val="center"/>
+              <w:rPr>
+                <w:rFonts w:ascii="Calibri" w:hAnsi="Calibri" w:cs="Calibri"/>
+                <w:sz w:val="16"/>
+                <w:szCs w:val="16"/>
+              </w:rPr>
+            </w:pPr>
+            <w:r>
+              <w:rPr>
+                <w:rFonts w:ascii="Calibri" w:hAnsi="Calibri" w:cs="Calibri"/>
+                <w:sz w:val="16"/>
+                <w:szCs w:val="16"/>
+              </w:rPr>
+              <w:fldChar w:fldCharType="begin"/>
+            </w:r>
+            <w:r>
+              <w:rPr>
+                <w:rFonts w:ascii="Calibri" w:hAnsi="Calibri" w:cs="Calibri"/>
+                <w:sz w:val="16"/>
+                <w:szCs w:val="16"/>
+              </w:rPr>
               <w:instrText xml:space="preserve"> MERGEFIELD  cant_minero  \* MERGEFORMAT </w:instrText>
             </w:r>
             <w:r>
@@ -1729,28 +1753,11 @@
             <w:r>
               <w:rPr>
                 <w:rFonts w:ascii="Calibri" w:hAnsi="Calibri" w:cs="Calibri"/>
-                <w:sz w:val="16"/>
-                <w:szCs w:val="16"/>
-              </w:rPr>
-              <w:t>«</w:t>
-            </w:r>
-            <w:proofErr w:type="spellStart"/>
-            <w:r>
-              <w:rPr>
-                <w:rFonts w:ascii="Calibri" w:hAnsi="Calibri" w:cs="Calibri"/>
-                <w:sz w:val="16"/>
-                <w:szCs w:val="16"/>
-              </w:rPr>
-              <w:t>cant_minero</w:t>
-            </w:r>
-            <w:proofErr w:type="spellEnd"/>
-            <w:r>
-              <w:rPr>
-                <w:rFonts w:ascii="Calibri" w:hAnsi="Calibri" w:cs="Calibri"/>
-                <w:sz w:val="16"/>
-                <w:szCs w:val="16"/>
-              </w:rPr>
-              <w:t>»</w:t>
+                <w:noProof/>
+                <w:sz w:val="16"/>
+                <w:szCs w:val="16"/>
+              </w:rPr>
+              <w:t>«cant_minero»</w:t>
             </w:r>
             <w:r>
               <w:rPr>
@@ -1764,7 +1771,7 @@
         </w:tc>
         <w:tc>
           <w:tcPr>
-            <w:tcW w:w="1276" w:type="dxa"/>
+            <w:tcW w:w="851" w:type="dxa"/>
           </w:tcPr>
           <w:p>
             <w:pPr>
@@ -1793,7 +1800,7 @@
                 <w:sz w:val="16"/>
                 <w:szCs w:val="16"/>
               </w:rPr>
-              <w:instrText xml:space="preserve"> MERGEFIELD  cant  \* MERGEFORMAT </w:instrText>
+              <w:instrText xml:space="preserve"> MERGEFIELD  tmh  \* MERGEFORMAT </w:instrText>
             </w:r>
             <w:r>
               <w:rPr>
@@ -1809,25 +1816,7 @@
                 <w:sz w:val="16"/>
                 <w:szCs w:val="16"/>
               </w:rPr>
-              <w:t>«</w:t>
-            </w:r>
-            <w:proofErr w:type="spellStart"/>
-            <w:r>
-              <w:rPr>
-                <w:rFonts w:ascii="Calibri" w:hAnsi="Calibri" w:cs="Calibri"/>
-                <w:sz w:val="16"/>
-                <w:szCs w:val="16"/>
-              </w:rPr>
-              <w:t>cant</w:t>
-            </w:r>
-            <w:proofErr w:type="spellEnd"/>
-            <w:r>
-              <w:rPr>
-                <w:rFonts w:ascii="Calibri" w:hAnsi="Calibri" w:cs="Calibri"/>
-                <w:sz w:val="16"/>
-                <w:szCs w:val="16"/>
-              </w:rPr>
-              <w:t>»</w:t>
+              <w:t>«tmh»</w:t>
             </w:r>
             <w:r>
               <w:rPr>
@@ -1841,7 +1830,7 @@
         </w:tc>
         <w:tc>
           <w:tcPr>
-            <w:tcW w:w="851" w:type="dxa"/>
+            <w:tcW w:w="1984" w:type="dxa"/>
           </w:tcPr>
           <w:p>
             <w:pPr>
@@ -1870,7 +1859,7 @@
                 <w:sz w:val="16"/>
                 <w:szCs w:val="16"/>
               </w:rPr>
-              <w:instrText xml:space="preserve"> MERGEFIELD  tmh  \* MERGEFORMAT </w:instrText>
+              <w:instrText xml:space="preserve"> MERGEFIELD  transportista  \* MERGEFORMAT </w:instrText>
             </w:r>
             <w:r>
               <w:rPr>
@@ -1886,25 +1875,7 @@
                 <w:sz w:val="16"/>
                 <w:szCs w:val="16"/>
               </w:rPr>
-              <w:t>«</w:t>
-            </w:r>
-            <w:proofErr w:type="spellStart"/>
-            <w:r>
-              <w:rPr>
-                <w:rFonts w:ascii="Calibri" w:hAnsi="Calibri" w:cs="Calibri"/>
-                <w:sz w:val="16"/>
-                <w:szCs w:val="16"/>
-              </w:rPr>
-              <w:t>tmh</w:t>
-            </w:r>
-            <w:proofErr w:type="spellEnd"/>
-            <w:r>
-              <w:rPr>
-                <w:rFonts w:ascii="Calibri" w:hAnsi="Calibri" w:cs="Calibri"/>
-                <w:sz w:val="16"/>
-                <w:szCs w:val="16"/>
-              </w:rPr>
-              <w:t>»</w:t>
+              <w:t>«transportista»</w:t>
             </w:r>
             <w:r>
               <w:rPr>
@@ -1918,7 +1889,7 @@
         </w:tc>
         <w:tc>
           <w:tcPr>
-            <w:tcW w:w="1984" w:type="dxa"/>
+            <w:tcW w:w="1134" w:type="dxa"/>
           </w:tcPr>
           <w:p>
             <w:pPr>
@@ -1947,7 +1918,7 @@
                 <w:sz w:val="16"/>
                 <w:szCs w:val="16"/>
               </w:rPr>
-              <w:instrText xml:space="preserve"> MERGEFIELD  transportista  \* MERGEFORMAT </w:instrText>
+              <w:instrText xml:space="preserve"> MERGEFIELD  nro_grr  \* MERGEFORMAT </w:instrText>
             </w:r>
             <w:r>
               <w:rPr>
@@ -1963,7 +1934,7 @@
                 <w:sz w:val="16"/>
                 <w:szCs w:val="16"/>
               </w:rPr>
-              <w:t>«transportista»</w:t>
+              <w:t>«nro_grr»</w:t>
             </w:r>
             <w:r>
               <w:rPr>
@@ -1977,7 +1948,7 @@
         </w:tc>
         <w:tc>
           <w:tcPr>
-            <w:tcW w:w="1134" w:type="dxa"/>
+            <w:tcW w:w="1418" w:type="dxa"/>
           </w:tcPr>
           <w:p>
             <w:pPr>
@@ -2006,7 +1977,7 @@
                 <w:sz w:val="16"/>
                 <w:szCs w:val="16"/>
               </w:rPr>
-              <w:instrText xml:space="preserve"> MERGEFIELD  nro_grr  \* MERGEFORMAT </w:instrText>
+              <w:instrText xml:space="preserve"> MERGEFIELD  nro_grt  \* MERGEFORMAT </w:instrText>
             </w:r>
             <w:r>
               <w:rPr>
@@ -2022,25 +1993,7 @@
                 <w:sz w:val="16"/>
                 <w:szCs w:val="16"/>
               </w:rPr>
-              <w:t>«</w:t>
-            </w:r>
-            <w:proofErr w:type="spellStart"/>
-            <w:r>
-              <w:rPr>
-                <w:rFonts w:ascii="Calibri" w:hAnsi="Calibri" w:cs="Calibri"/>
-                <w:sz w:val="16"/>
-                <w:szCs w:val="16"/>
-              </w:rPr>
-              <w:t>nro_grr</w:t>
-            </w:r>
-            <w:proofErr w:type="spellEnd"/>
-            <w:r>
-              <w:rPr>
-                <w:rFonts w:ascii="Calibri" w:hAnsi="Calibri" w:cs="Calibri"/>
-                <w:sz w:val="16"/>
-                <w:szCs w:val="16"/>
-              </w:rPr>
-              <w:t>»</w:t>
+              <w:t>«nro_grt»</w:t>
             </w:r>
             <w:r>
               <w:rPr>
@@ -2054,7 +2007,7 @@
         </w:tc>
         <w:tc>
           <w:tcPr>
-            <w:tcW w:w="1418" w:type="dxa"/>
+            <w:tcW w:w="1417" w:type="dxa"/>
           </w:tcPr>
           <w:p>
             <w:pPr>
@@ -2083,7 +2036,7 @@
                 <w:sz w:val="16"/>
                 <w:szCs w:val="16"/>
               </w:rPr>
-              <w:instrText xml:space="preserve"> MERGEFIELD  nro_grt  \* MERGEFORMAT </w:instrText>
+              <w:instrText xml:space="preserve"> MERGEFIELD  observacion  \* MERGEFORMAT </w:instrText>
             </w:r>
             <w:r>
               <w:rPr>
@@ -2099,102 +2052,7 @@
                 <w:sz w:val="16"/>
                 <w:szCs w:val="16"/>
               </w:rPr>
-              <w:t>«</w:t>
-            </w:r>
-            <w:proofErr w:type="spellStart"/>
-            <w:r>
-              <w:rPr>
-                <w:rFonts w:ascii="Calibri" w:hAnsi="Calibri" w:cs="Calibri"/>
-                <w:sz w:val="16"/>
-                <w:szCs w:val="16"/>
-              </w:rPr>
-              <w:t>nro_grt</w:t>
-            </w:r>
-            <w:proofErr w:type="spellEnd"/>
-            <w:r>
-              <w:rPr>
-                <w:rFonts w:ascii="Calibri" w:hAnsi="Calibri" w:cs="Calibri"/>
-                <w:sz w:val="16"/>
-                <w:szCs w:val="16"/>
-              </w:rPr>
-              <w:t>»</w:t>
-            </w:r>
-            <w:r>
-              <w:rPr>
-                <w:rFonts w:ascii="Calibri" w:hAnsi="Calibri" w:cs="Calibri"/>
-                <w:sz w:val="16"/>
-                <w:szCs w:val="16"/>
-              </w:rPr>
-              <w:fldChar w:fldCharType="end"/>
-            </w:r>
-          </w:p>
-        </w:tc>
-        <w:tc>
-          <w:tcPr>
-            <w:tcW w:w="1417" w:type="dxa"/>
-          </w:tcPr>
-          <w:p>
-            <w:pPr>
-              <w:tabs>
-                <w:tab w:val="left" w:pos="284"/>
-              </w:tabs>
-              <w:ind w:right="-1"/>
-              <w:jc w:val="center"/>
-              <w:rPr>
-                <w:rFonts w:ascii="Calibri" w:hAnsi="Calibri" w:cs="Calibri"/>
-                <w:sz w:val="16"/>
-                <w:szCs w:val="16"/>
-              </w:rPr>
-            </w:pPr>
-            <w:r>
-              <w:rPr>
-                <w:rFonts w:ascii="Calibri" w:hAnsi="Calibri" w:cs="Calibri"/>
-                <w:sz w:val="16"/>
-                <w:szCs w:val="16"/>
-              </w:rPr>
-              <w:fldChar w:fldCharType="begin"/>
-            </w:r>
-            <w:r>
-              <w:rPr>
-                <w:rFonts w:ascii="Calibri" w:hAnsi="Calibri" w:cs="Calibri"/>
-                <w:sz w:val="16"/>
-                <w:szCs w:val="16"/>
-              </w:rPr>
-              <w:instrText xml:space="preserve"> MERGEFIELD  observacion  \* MERGEFORMAT </w:instrText>
-            </w:r>
-            <w:r>
-              <w:rPr>
-                <w:rFonts w:ascii="Calibri" w:hAnsi="Calibri" w:cs="Calibri"/>
-                <w:sz w:val="16"/>
-                <w:szCs w:val="16"/>
-              </w:rPr>
-              <w:fldChar w:fldCharType="separate"/>
-            </w:r>
-            <w:r>
-              <w:rPr>
-                <w:rFonts w:ascii="Calibri" w:hAnsi="Calibri" w:cs="Calibri"/>
-                <w:sz w:val="16"/>
-                <w:szCs w:val="16"/>
-              </w:rPr>
-              <w:t>«</w:t>
-            </w:r>
-            <w:proofErr w:type="spellStart"/>
-            <w:r>
-              <w:rPr>
-                <w:rFonts w:ascii="Calibri" w:hAnsi="Calibri" w:cs="Calibri"/>
-                <w:sz w:val="16"/>
-                <w:szCs w:val="16"/>
-              </w:rPr>
-              <w:t>observacion</w:t>
-            </w:r>
-            <w:proofErr w:type="spellEnd"/>
-            <w:r>
-              <w:rPr>
-                <w:rFonts w:ascii="Calibri" w:hAnsi="Calibri" w:cs="Calibri"/>
-                <w:sz w:val="16"/>
-                <w:szCs w:val="16"/>
-              </w:rPr>
-              <w:t>»</w:t>
+              <w:t>«observacion»</w:t>
             </w:r>
             <w:r>
               <w:rPr>
@@ -2241,27 +2099,7 @@
                 <w:sz w:val="2"/>
                 <w:szCs w:val="2"/>
               </w:rPr>
-              <w:t>«</w:t>
-            </w:r>
-            <w:proofErr w:type="spellStart"/>
-            <w:r>
-              <w:rPr>
-                <w:b/>
-                <w:noProof/>
-                <w:sz w:val="2"/>
-                <w:szCs w:val="2"/>
-              </w:rPr>
-              <w:t>tableend:lotes</w:t>
-            </w:r>
-            <w:proofErr w:type="spellEnd"/>
-            <w:r>
-              <w:rPr>
-                <w:b/>
-                <w:noProof/>
-                <w:sz w:val="2"/>
-                <w:szCs w:val="2"/>
-              </w:rPr>
-              <w:t>»</w:t>
+              <w:t>«tableend:lotes»</w:t>
             </w:r>
             <w:r>
               <w:rPr>

</xml_diff>

<commit_message>
feat: agregar formato para acta conformidad
</commit_message>
<xml_diff>
--- a/pesaje/analytica/Report/PrintActaConformidad.docx
+++ b/pesaje/analytica/Report/PrintActaConformidad.docx
@@ -11,20 +11,20 @@
         <w:tblLook w:val="04A0" w:firstRow="1" w:lastRow="0" w:firstColumn="1" w:lastColumn="0" w:noHBand="0" w:noVBand="1"/>
       </w:tblPr>
       <w:tblGrid>
-        <w:gridCol w:w="567"/>
-        <w:gridCol w:w="704"/>
+        <w:gridCol w:w="562"/>
+        <w:gridCol w:w="709"/>
         <w:gridCol w:w="1134"/>
         <w:gridCol w:w="1134"/>
-        <w:gridCol w:w="709"/>
-        <w:gridCol w:w="3260"/>
+        <w:gridCol w:w="851"/>
+        <w:gridCol w:w="3118"/>
         <w:gridCol w:w="1134"/>
-        <w:gridCol w:w="1139"/>
-        <w:gridCol w:w="1559"/>
+        <w:gridCol w:w="1276"/>
+        <w:gridCol w:w="1422"/>
       </w:tblGrid>
       <w:tr>
         <w:tc>
           <w:tcPr>
-            <w:tcW w:w="567" w:type="dxa"/>
+            <w:tcW w:w="562" w:type="dxa"/>
             <w:shd w:val="clear" w:color="auto" w:fill="9BC2E6"/>
           </w:tcPr>
           <w:p>
@@ -52,7 +52,7 @@
         </w:tc>
         <w:tc>
           <w:tcPr>
-            <w:tcW w:w="704" w:type="dxa"/>
+            <w:tcW w:w="709" w:type="dxa"/>
             <w:shd w:val="clear" w:color="auto" w:fill="9BC2E6"/>
           </w:tcPr>
           <w:p>
@@ -136,7 +136,7 @@
         </w:tc>
         <w:tc>
           <w:tcPr>
-            <w:tcW w:w="709" w:type="dxa"/>
+            <w:tcW w:w="851" w:type="dxa"/>
             <w:shd w:val="clear" w:color="auto" w:fill="9BC2E6"/>
           </w:tcPr>
           <w:p>
@@ -164,7 +164,7 @@
         </w:tc>
         <w:tc>
           <w:tcPr>
-            <w:tcW w:w="3260" w:type="dxa"/>
+            <w:tcW w:w="3118" w:type="dxa"/>
             <w:shd w:val="clear" w:color="auto" w:fill="9BC2E6"/>
           </w:tcPr>
           <w:p>
@@ -220,7 +220,7 @@
         </w:tc>
         <w:tc>
           <w:tcPr>
-            <w:tcW w:w="1139" w:type="dxa"/>
+            <w:tcW w:w="1276" w:type="dxa"/>
             <w:shd w:val="clear" w:color="auto" w:fill="9BC2E6"/>
           </w:tcPr>
           <w:p>
@@ -248,7 +248,7 @@
         </w:tc>
         <w:tc>
           <w:tcPr>
-            <w:tcW w:w="1559" w:type="dxa"/>
+            <w:tcW w:w="1422" w:type="dxa"/>
             <w:shd w:val="clear" w:color="auto" w:fill="9BC2E6"/>
           </w:tcPr>
           <w:p>
@@ -278,7 +278,7 @@
       <w:tr>
         <w:tc>
           <w:tcPr>
-            <w:tcW w:w="567" w:type="dxa"/>
+            <w:tcW w:w="562" w:type="dxa"/>
           </w:tcPr>
           <w:p>
             <w:pPr>
@@ -391,7 +391,7 @@
         </w:tc>
         <w:tc>
           <w:tcPr>
-            <w:tcW w:w="704" w:type="dxa"/>
+            <w:tcW w:w="709" w:type="dxa"/>
           </w:tcPr>
           <w:p>
             <w:pPr>
@@ -570,7 +570,7 @@
         </w:tc>
         <w:tc>
           <w:tcPr>
-            <w:tcW w:w="709" w:type="dxa"/>
+            <w:tcW w:w="851" w:type="dxa"/>
           </w:tcPr>
           <w:p>
             <w:pPr>
@@ -629,7 +629,7 @@
         </w:tc>
         <w:tc>
           <w:tcPr>
-            <w:tcW w:w="3260" w:type="dxa"/>
+            <w:tcW w:w="3118" w:type="dxa"/>
           </w:tcPr>
           <w:p>
             <w:pPr>
@@ -747,7 +747,7 @@
         </w:tc>
         <w:tc>
           <w:tcPr>
-            <w:tcW w:w="1139" w:type="dxa"/>
+            <w:tcW w:w="1276" w:type="dxa"/>
           </w:tcPr>
           <w:p>
             <w:pPr>
@@ -806,7 +806,7 @@
         </w:tc>
         <w:tc>
           <w:tcPr>
-            <w:tcW w:w="1559" w:type="dxa"/>
+            <w:tcW w:w="1422" w:type="dxa"/>
           </w:tcPr>
           <w:p>
             <w:pPr>
@@ -1100,7 +1100,7 @@
         </w:tc>
         <w:tc>
           <w:tcPr>
-            <w:tcW w:w="709" w:type="dxa"/>
+            <w:tcW w:w="851" w:type="dxa"/>
             <w:shd w:val="clear" w:color="auto" w:fill="9BC2E6"/>
           </w:tcPr>
           <w:p>
@@ -1161,7 +1161,7 @@
         </w:tc>
         <w:tc>
           <w:tcPr>
-            <w:tcW w:w="3260" w:type="dxa"/>
+            <w:tcW w:w="3118" w:type="dxa"/>
           </w:tcPr>
           <w:p>
             <w:pPr>
@@ -1199,7 +1199,7 @@
         </w:tc>
         <w:tc>
           <w:tcPr>
-            <w:tcW w:w="1139" w:type="dxa"/>
+            <w:tcW w:w="1276" w:type="dxa"/>
           </w:tcPr>
           <w:p>
             <w:pPr>
@@ -1218,7 +1218,7 @@
         </w:tc>
         <w:tc>
           <w:tcPr>
-            <w:tcW w:w="1559" w:type="dxa"/>
+            <w:tcW w:w="1422" w:type="dxa"/>
           </w:tcPr>
           <w:p>
             <w:pPr>
@@ -1685,29 +1685,11 @@
           </w:tcBorders>
         </w:tcPr>
         <w:p>
-          <w:r>
-            <w:fldChar w:fldCharType="begin"/>
-          </w:r>
-          <w:r>
-            <w:instrText xml:space="preserve"> MERGEFIELD  nom_encargado  \* MERGEFORMAT </w:instrText>
-          </w:r>
-          <w:r>
-            <w:fldChar w:fldCharType="separate"/>
-          </w:r>
-          <w:r>
-            <w:t>«</w:t>
-          </w:r>
-          <w:proofErr w:type="spellStart"/>
-          <w:r>
-            <w:t>nom_encargado</w:t>
-          </w:r>
-          <w:proofErr w:type="spellEnd"/>
-          <w:r>
-            <w:t>»</w:t>
-          </w:r>
-          <w:r>
-            <w:fldChar w:fldCharType="end"/>
-          </w:r>
+          <w:fldSimple w:instr=" MERGEFIELD  nom_encargado  \* MERGEFORMAT ">
+            <w:r>
+              <w:t>«nom_encargado»</w:t>
+            </w:r>
+          </w:fldSimple>
         </w:p>
       </w:tc>
       <w:tc>
@@ -1795,29 +1777,11 @@
           </w:tcBorders>
         </w:tcPr>
         <w:p>
-          <w:r>
-            <w:fldChar w:fldCharType="begin"/>
-          </w:r>
-          <w:r>
-            <w:instrText xml:space="preserve"> MERGEFIELD  doc_encargado  \* MERGEFORMAT </w:instrText>
-          </w:r>
-          <w:r>
-            <w:fldChar w:fldCharType="separate"/>
-          </w:r>
-          <w:r>
-            <w:t>«</w:t>
-          </w:r>
-          <w:proofErr w:type="spellStart"/>
-          <w:r>
-            <w:t>doc_encargado</w:t>
-          </w:r>
-          <w:proofErr w:type="spellEnd"/>
-          <w:r>
-            <w:t>»</w:t>
-          </w:r>
-          <w:r>
-            <w:fldChar w:fldCharType="end"/>
-          </w:r>
+          <w:fldSimple w:instr=" MERGEFIELD  doc_encargado  \* MERGEFORMAT ">
+            <w:r>
+              <w:t>«doc_encargado»</w:t>
+            </w:r>
+          </w:fldSimple>
         </w:p>
       </w:tc>
       <w:tc>
@@ -2660,25 +2624,7 @@
               <w:sz w:val="16"/>
               <w:szCs w:val="16"/>
             </w:rPr>
-            <w:t>«</w:t>
-          </w:r>
-          <w:proofErr w:type="spellStart"/>
-          <w:r>
-            <w:rPr>
-              <w:rFonts w:ascii="Calibri" w:hAnsi="Calibri" w:cs="Calibri"/>
-              <w:sz w:val="16"/>
-              <w:szCs w:val="16"/>
-            </w:rPr>
-            <w:t>fecha_descarga</w:t>
-          </w:r>
-          <w:proofErr w:type="spellEnd"/>
-          <w:r>
-            <w:rPr>
-              <w:rFonts w:ascii="Calibri" w:hAnsi="Calibri" w:cs="Calibri"/>
-              <w:sz w:val="16"/>
-              <w:szCs w:val="16"/>
-            </w:rPr>
-            <w:t>»</w:t>
+            <w:t>«fecha_descarga»</w:t>
           </w:r>
           <w:r>
             <w:rPr>
@@ -2812,25 +2758,7 @@
               <w:sz w:val="16"/>
               <w:szCs w:val="16"/>
             </w:rPr>
-            <w:t>«</w:t>
-          </w:r>
-          <w:proofErr w:type="spellStart"/>
-          <w:r>
-            <w:rPr>
-              <w:rFonts w:ascii="Calibri" w:hAnsi="Calibri" w:cs="Calibri"/>
-              <w:sz w:val="16"/>
-              <w:szCs w:val="16"/>
-            </w:rPr>
-            <w:t>hora_descarga</w:t>
-          </w:r>
-          <w:proofErr w:type="spellEnd"/>
-          <w:r>
-            <w:rPr>
-              <w:rFonts w:ascii="Calibri" w:hAnsi="Calibri" w:cs="Calibri"/>
-              <w:sz w:val="16"/>
-              <w:szCs w:val="16"/>
-            </w:rPr>
-            <w:t>»</w:t>
+            <w:t>«hora_descarga»</w:t>
           </w:r>
           <w:r>
             <w:rPr>
@@ -3232,25 +3160,7 @@
               <w:sz w:val="16"/>
               <w:szCs w:val="16"/>
             </w:rPr>
-            <w:t>«</w:t>
-          </w:r>
-          <w:proofErr w:type="spellStart"/>
-          <w:r>
-            <w:rPr>
-              <w:rFonts w:ascii="Calibri" w:hAnsi="Calibri" w:cs="Calibri"/>
-              <w:sz w:val="16"/>
-              <w:szCs w:val="16"/>
-            </w:rPr>
-            <w:t>nom_conductor</w:t>
-          </w:r>
-          <w:proofErr w:type="spellEnd"/>
-          <w:r>
-            <w:rPr>
-              <w:rFonts w:ascii="Calibri" w:hAnsi="Calibri" w:cs="Calibri"/>
-              <w:sz w:val="16"/>
-              <w:szCs w:val="16"/>
-            </w:rPr>
-            <w:t>»</w:t>
+            <w:t>«nom_conductor»</w:t>
           </w:r>
           <w:r>
             <w:rPr>
@@ -3384,25 +3294,7 @@
               <w:sz w:val="16"/>
               <w:szCs w:val="16"/>
             </w:rPr>
-            <w:t>«</w:t>
-          </w:r>
-          <w:proofErr w:type="spellStart"/>
-          <w:r>
-            <w:rPr>
-              <w:rFonts w:ascii="Calibri" w:hAnsi="Calibri" w:cs="Calibri"/>
-              <w:sz w:val="16"/>
-              <w:szCs w:val="16"/>
-            </w:rPr>
-            <w:t>doc_conductor</w:t>
-          </w:r>
-          <w:proofErr w:type="spellEnd"/>
-          <w:r>
-            <w:rPr>
-              <w:rFonts w:ascii="Calibri" w:hAnsi="Calibri" w:cs="Calibri"/>
-              <w:sz w:val="16"/>
-              <w:szCs w:val="16"/>
-            </w:rPr>
-            <w:t>»</w:t>
+            <w:t>«doc_conductor»</w:t>
           </w:r>
           <w:r>
             <w:rPr>
@@ -3536,25 +3428,7 @@
               <w:sz w:val="16"/>
               <w:szCs w:val="16"/>
             </w:rPr>
-            <w:t>«</w:t>
-          </w:r>
-          <w:proofErr w:type="spellStart"/>
-          <w:r>
-            <w:rPr>
-              <w:rFonts w:ascii="Calibri" w:hAnsi="Calibri" w:cs="Calibri"/>
-              <w:sz w:val="16"/>
-              <w:szCs w:val="16"/>
-            </w:rPr>
-            <w:t>nro_placa</w:t>
-          </w:r>
-          <w:proofErr w:type="spellEnd"/>
-          <w:r>
-            <w:rPr>
-              <w:rFonts w:ascii="Calibri" w:hAnsi="Calibri" w:cs="Calibri"/>
-              <w:sz w:val="16"/>
-              <w:szCs w:val="16"/>
-            </w:rPr>
-            <w:t>»</w:t>
+            <w:t>«nro_placa»</w:t>
           </w:r>
           <w:r>
             <w:rPr>

</xml_diff>

<commit_message>
feat: actualizar plantillas de lote
</commit_message>
<xml_diff>
--- a/pesaje/analytica/Report/PrintActaConformidad.docx
+++ b/pesaje/analytica/Report/PrintActaConformidad.docx
@@ -15,13 +15,16 @@
         <w:gridCol w:w="709"/>
         <w:gridCol w:w="1134"/>
         <w:gridCol w:w="1134"/>
-        <w:gridCol w:w="851"/>
-        <w:gridCol w:w="3402"/>
-        <w:gridCol w:w="992"/>
-        <w:gridCol w:w="1276"/>
-        <w:gridCol w:w="1280"/>
+        <w:gridCol w:w="709"/>
+        <w:gridCol w:w="3969"/>
+        <w:gridCol w:w="850"/>
+        <w:gridCol w:w="1134"/>
+        <w:gridCol w:w="1139"/>
       </w:tblGrid>
       <w:tr>
+        <w:trPr>
+          <w:tblHeader/>
+        </w:trPr>
         <w:tc>
           <w:tcPr>
             <w:tcW w:w="562" w:type="dxa"/>
@@ -136,7 +139,7 @@
         </w:tc>
         <w:tc>
           <w:tcPr>
-            <w:tcW w:w="851" w:type="dxa"/>
+            <w:tcW w:w="709" w:type="dxa"/>
             <w:shd w:val="clear" w:color="auto" w:fill="9BC2E6"/>
           </w:tcPr>
           <w:p>
@@ -164,7 +167,7 @@
         </w:tc>
         <w:tc>
           <w:tcPr>
-            <w:tcW w:w="3402" w:type="dxa"/>
+            <w:tcW w:w="3969" w:type="dxa"/>
             <w:shd w:val="clear" w:color="auto" w:fill="9BC2E6"/>
           </w:tcPr>
           <w:p>
@@ -192,7 +195,7 @@
         </w:tc>
         <w:tc>
           <w:tcPr>
-            <w:tcW w:w="992" w:type="dxa"/>
+            <w:tcW w:w="850" w:type="dxa"/>
             <w:shd w:val="clear" w:color="auto" w:fill="9BC2E6"/>
           </w:tcPr>
           <w:p>
@@ -220,7 +223,7 @@
         </w:tc>
         <w:tc>
           <w:tcPr>
-            <w:tcW w:w="1276" w:type="dxa"/>
+            <w:tcW w:w="1134" w:type="dxa"/>
             <w:shd w:val="clear" w:color="auto" w:fill="9BC2E6"/>
           </w:tcPr>
           <w:p>
@@ -248,7 +251,7 @@
         </w:tc>
         <w:tc>
           <w:tcPr>
-            <w:tcW w:w="1280" w:type="dxa"/>
+            <w:tcW w:w="1139" w:type="dxa"/>
             <w:shd w:val="clear" w:color="auto" w:fill="9BC2E6"/>
           </w:tcPr>
           <w:p>
@@ -570,7 +573,7 @@
         </w:tc>
         <w:tc>
           <w:tcPr>
-            <w:tcW w:w="851" w:type="dxa"/>
+            <w:tcW w:w="709" w:type="dxa"/>
           </w:tcPr>
           <w:p>
             <w:pPr>
@@ -629,7 +632,7 @@
         </w:tc>
         <w:tc>
           <w:tcPr>
-            <w:tcW w:w="3402" w:type="dxa"/>
+            <w:tcW w:w="3969" w:type="dxa"/>
           </w:tcPr>
           <w:p>
             <w:pPr>
@@ -688,7 +691,7 @@
         </w:tc>
         <w:tc>
           <w:tcPr>
-            <w:tcW w:w="992" w:type="dxa"/>
+            <w:tcW w:w="850" w:type="dxa"/>
           </w:tcPr>
           <w:p>
             <w:pPr>
@@ -747,7 +750,7 @@
         </w:tc>
         <w:tc>
           <w:tcPr>
-            <w:tcW w:w="1276" w:type="dxa"/>
+            <w:tcW w:w="1134" w:type="dxa"/>
           </w:tcPr>
           <w:p>
             <w:pPr>
@@ -806,7 +809,7 @@
         </w:tc>
         <w:tc>
           <w:tcPr>
-            <w:tcW w:w="1280" w:type="dxa"/>
+            <w:tcW w:w="1139" w:type="dxa"/>
           </w:tcPr>
           <w:p>
             <w:pPr>
@@ -1100,7 +1103,7 @@
         </w:tc>
         <w:tc>
           <w:tcPr>
-            <w:tcW w:w="851" w:type="dxa"/>
+            <w:tcW w:w="709" w:type="dxa"/>
             <w:shd w:val="clear" w:color="auto" w:fill="9BC2E6"/>
           </w:tcPr>
           <w:p>
@@ -1161,7 +1164,7 @@
         </w:tc>
         <w:tc>
           <w:tcPr>
-            <w:tcW w:w="3402" w:type="dxa"/>
+            <w:tcW w:w="3969" w:type="dxa"/>
           </w:tcPr>
           <w:p>
             <w:pPr>
@@ -1180,7 +1183,7 @@
         </w:tc>
         <w:tc>
           <w:tcPr>
-            <w:tcW w:w="992" w:type="dxa"/>
+            <w:tcW w:w="850" w:type="dxa"/>
           </w:tcPr>
           <w:p>
             <w:pPr>
@@ -1199,7 +1202,7 @@
         </w:tc>
         <w:tc>
           <w:tcPr>
-            <w:tcW w:w="1276" w:type="dxa"/>
+            <w:tcW w:w="1134" w:type="dxa"/>
           </w:tcPr>
           <w:p>
             <w:pPr>
@@ -1218,7 +1221,7 @@
         </w:tc>
         <w:tc>
           <w:tcPr>
-            <w:tcW w:w="1280" w:type="dxa"/>
+            <w:tcW w:w="1139" w:type="dxa"/>
           </w:tcPr>
           <w:p>
             <w:pPr>
@@ -1685,29 +1688,11 @@
           </w:tcBorders>
         </w:tcPr>
         <w:p>
-          <w:r>
-            <w:fldChar w:fldCharType="begin"/>
-          </w:r>
-          <w:r>
-            <w:instrText xml:space="preserve"> MERGEFIELD  nom_encargado  \* MERGEFORMAT </w:instrText>
-          </w:r>
-          <w:r>
-            <w:fldChar w:fldCharType="separate"/>
-          </w:r>
-          <w:r>
-            <w:t>«</w:t>
-          </w:r>
-          <w:proofErr w:type="spellStart"/>
-          <w:r>
-            <w:t>nom_encargado</w:t>
-          </w:r>
-          <w:proofErr w:type="spellEnd"/>
-          <w:r>
-            <w:t>»</w:t>
-          </w:r>
-          <w:r>
-            <w:fldChar w:fldCharType="end"/>
-          </w:r>
+          <w:fldSimple w:instr=" MERGEFIELD  nom_encargado  \* MERGEFORMAT ">
+            <w:r>
+              <w:t>«nom_encargado»</w:t>
+            </w:r>
+          </w:fldSimple>
         </w:p>
       </w:tc>
       <w:tc>
@@ -1795,29 +1780,11 @@
           </w:tcBorders>
         </w:tcPr>
         <w:p>
-          <w:r>
-            <w:fldChar w:fldCharType="begin"/>
-          </w:r>
-          <w:r>
-            <w:instrText xml:space="preserve"> MERGEFIELD  doc_encargado  \* MERGEFORMAT </w:instrText>
-          </w:r>
-          <w:r>
-            <w:fldChar w:fldCharType="separate"/>
-          </w:r>
-          <w:r>
-            <w:t>«</w:t>
-          </w:r>
-          <w:proofErr w:type="spellStart"/>
-          <w:r>
-            <w:t>doc_encargado</w:t>
-          </w:r>
-          <w:proofErr w:type="spellEnd"/>
-          <w:r>
-            <w:t>»</w:t>
-          </w:r>
-          <w:r>
-            <w:fldChar w:fldCharType="end"/>
-          </w:r>
+          <w:fldSimple w:instr=" MERGEFIELD  doc_encargado  \* MERGEFORMAT ">
+            <w:r>
+              <w:t>«doc_encargado»</w:t>
+            </w:r>
+          </w:fldSimple>
         </w:p>
       </w:tc>
       <w:tc>
@@ -2660,25 +2627,7 @@
               <w:sz w:val="16"/>
               <w:szCs w:val="16"/>
             </w:rPr>
-            <w:t>«</w:t>
-          </w:r>
-          <w:proofErr w:type="spellStart"/>
-          <w:r>
-            <w:rPr>
-              <w:rFonts w:ascii="Calibri" w:hAnsi="Calibri" w:cs="Calibri"/>
-              <w:sz w:val="16"/>
-              <w:szCs w:val="16"/>
-            </w:rPr>
-            <w:t>fecha_descarga</w:t>
-          </w:r>
-          <w:proofErr w:type="spellEnd"/>
-          <w:r>
-            <w:rPr>
-              <w:rFonts w:ascii="Calibri" w:hAnsi="Calibri" w:cs="Calibri"/>
-              <w:sz w:val="16"/>
-              <w:szCs w:val="16"/>
-            </w:rPr>
-            <w:t>»</w:t>
+            <w:t>«fecha_descarga»</w:t>
           </w:r>
           <w:r>
             <w:rPr>
@@ -2812,25 +2761,7 @@
               <w:sz w:val="16"/>
               <w:szCs w:val="16"/>
             </w:rPr>
-            <w:t>«</w:t>
-          </w:r>
-          <w:proofErr w:type="spellStart"/>
-          <w:r>
-            <w:rPr>
-              <w:rFonts w:ascii="Calibri" w:hAnsi="Calibri" w:cs="Calibri"/>
-              <w:sz w:val="16"/>
-              <w:szCs w:val="16"/>
-            </w:rPr>
-            <w:t>hora_descarga</w:t>
-          </w:r>
-          <w:proofErr w:type="spellEnd"/>
-          <w:r>
-            <w:rPr>
-              <w:rFonts w:ascii="Calibri" w:hAnsi="Calibri" w:cs="Calibri"/>
-              <w:sz w:val="16"/>
-              <w:szCs w:val="16"/>
-            </w:rPr>
-            <w:t>»</w:t>
+            <w:t>«hora_descarga»</w:t>
           </w:r>
           <w:r>
             <w:rPr>
@@ -3232,25 +3163,7 @@
               <w:sz w:val="16"/>
               <w:szCs w:val="16"/>
             </w:rPr>
-            <w:t>«</w:t>
-          </w:r>
-          <w:proofErr w:type="spellStart"/>
-          <w:r>
-            <w:rPr>
-              <w:rFonts w:ascii="Calibri" w:hAnsi="Calibri" w:cs="Calibri"/>
-              <w:sz w:val="16"/>
-              <w:szCs w:val="16"/>
-            </w:rPr>
-            <w:t>nom_conductor</w:t>
-          </w:r>
-          <w:proofErr w:type="spellEnd"/>
-          <w:r>
-            <w:rPr>
-              <w:rFonts w:ascii="Calibri" w:hAnsi="Calibri" w:cs="Calibri"/>
-              <w:sz w:val="16"/>
-              <w:szCs w:val="16"/>
-            </w:rPr>
-            <w:t>»</w:t>
+            <w:t>«nom_conductor»</w:t>
           </w:r>
           <w:r>
             <w:rPr>
@@ -3384,25 +3297,7 @@
               <w:sz w:val="16"/>
               <w:szCs w:val="16"/>
             </w:rPr>
-            <w:t>«</w:t>
-          </w:r>
-          <w:proofErr w:type="spellStart"/>
-          <w:r>
-            <w:rPr>
-              <w:rFonts w:ascii="Calibri" w:hAnsi="Calibri" w:cs="Calibri"/>
-              <w:sz w:val="16"/>
-              <w:szCs w:val="16"/>
-            </w:rPr>
-            <w:t>doc_conductor</w:t>
-          </w:r>
-          <w:proofErr w:type="spellEnd"/>
-          <w:r>
-            <w:rPr>
-              <w:rFonts w:ascii="Calibri" w:hAnsi="Calibri" w:cs="Calibri"/>
-              <w:sz w:val="16"/>
-              <w:szCs w:val="16"/>
-            </w:rPr>
-            <w:t>»</w:t>
+            <w:t>«doc_conductor»</w:t>
           </w:r>
           <w:r>
             <w:rPr>
@@ -3536,25 +3431,7 @@
               <w:sz w:val="16"/>
               <w:szCs w:val="16"/>
             </w:rPr>
-            <w:t>«</w:t>
-          </w:r>
-          <w:proofErr w:type="spellStart"/>
-          <w:r>
-            <w:rPr>
-              <w:rFonts w:ascii="Calibri" w:hAnsi="Calibri" w:cs="Calibri"/>
-              <w:sz w:val="16"/>
-              <w:szCs w:val="16"/>
-            </w:rPr>
-            <w:t>nro_placa</w:t>
-          </w:r>
-          <w:proofErr w:type="spellEnd"/>
-          <w:r>
-            <w:rPr>
-              <w:rFonts w:ascii="Calibri" w:hAnsi="Calibri" w:cs="Calibri"/>
-              <w:sz w:val="16"/>
-              <w:szCs w:val="16"/>
-            </w:rPr>
-            <w:t>»</w:t>
+            <w:t>«nro_placa»</w:t>
           </w:r>
           <w:r>
             <w:rPr>

</xml_diff>